<commit_message>
improve mobile recruitment conversion path
Co-authored-by: arena-agent <297053741+arena-agent@users.noreply.github.com>
</commit_message>
<xml_diff>
--- a/deliverables/孙承泽-思政课实践教学活动记录册_填报稿.docx
+++ b/deliverables/孙承泽-思政课实践教学活动记录册_填报稿.docx
@@ -135,223 +135,95 @@
         <w:pStyle w:val="Heading1"/>
       </w:pPr>
       <w:r>
-        <w:t xml:space="preserve">实践活动总结（不少于 2000 字）</w:t>
-      </w:r>
-    </w:p>
-    <w:p>
-      <w:pPr>
-        <w:pStyle w:val="Heading2"/>
-      </w:pPr>
-      <w:r>
-        <w:t xml:space="preserve">一、从“去上一堂课”到“共同打开一扇窗”</w:t>
-      </w:r>
-    </w:p>
-    <w:p>
-      <w:pPr>
-        <w:pStyle w:val="Normal"/>
-      </w:pPr>
-      <w:r>
-        <w:t xml:space="preserve">2026年暑假，我参加了西安交通大学英仔爱心社“知行秦川，梦启今夏”周至九峰分队的志愿服务活动。团队在周至县九峰初级中学开展为期六天的暑期夏令营，面向45名学生组织破冰、特色课程、体育手工、游园交流等活动。作为其中的一名志愿者，我主要承担“御风记”航空发动机科普课程的设计与讲授，并与队友共同组织初二学生排练英语话剧《龟兔赛跑》《丑小鸭》。在出发前，我最初把这次实践理解为一次“把知识讲清楚”的任务；而在与学生相处、备课、授课、复盘的过程中，我逐渐意识到，志愿服务并不只是知识从大学生单向流向中学生，更重要的是以平等、耐心和真实的互动，为孩子们打开一扇观察世界、表达自己、相信自己的窗口。</w:t>
-      </w:r>
-    </w:p>
-    <w:p>
-      <w:pPr>
-        <w:pStyle w:val="Normal"/>
-      </w:pPr>
-      <w:r>
-        <w:t xml:space="preserve">九峰中学夏令营的课堂不同于常规教学。学生们带着对暑假的期待走进教室，也带着各自不同的成长经历、知识基础和表达习惯。志愿者既不能把大学课堂的内容原样搬来，也不能只追求热闹而忽视学习的实际收获。如何在有限时间里把知识讲得有趣、讲得准确、讲得与学生有关，是我在实践开始前反复思考的问题。课程设计、教具准备、课堂节奏、互动方式以及课后交流，都是对责任心和沟通能力的考验。这段经历让我体会到，教育帮扶不是居高临下地“给予”，而是站在学生可以理解、愿意参与的位置上，与他们一起完成一次探索。</w:t>
-      </w:r>
-    </w:p>
-    <w:p>
-      <w:pPr>
-        <w:pStyle w:val="Heading2"/>
-      </w:pPr>
-      <w:r>
-        <w:t xml:space="preserve">二、“御风记”航空发动机课：让抽象知识从生活经验出发</w:t>
-      </w:r>
-    </w:p>
-    <w:p>
-      <w:pPr>
-        <w:pStyle w:val="Normal"/>
-      </w:pPr>
-      <w:r>
-        <w:t xml:space="preserve">我设计的“御风记”分为两节课。第一节以“驭火”为主题，第二节以“问道”为主题。选择航空发动机作为科普内容，源于自己对能源动力专业的学习兴趣，也源于一个朴素愿望：希望把看似遥远、复杂的工程知识，转化为中学生能够触摸和想象的科学问题。航空发动机涉及热力学、流体力学、材料科学、机械设计与控制等多个领域。如果直接罗列专业术语，学生很容易感到陌生甚至产生畏难情绪。因此，我在备课时始终提醒自己，课程的首要目标不是让学生记住多少名词，而是让他们发现：原来课本知识与飞机、气球、纸飞机、人工智能等身边或新闻中的事物相连；原来科学问题可以被追问、被动手验证，也可以成为未来学习的兴趣起点。</w:t>
-      </w:r>
-    </w:p>
-    <w:p>
-      <w:pPr>
-        <w:pStyle w:val="Normal"/>
-      </w:pPr>
-      <w:r>
-        <w:t xml:space="preserve">在“驭火”一课中，我从松手后会飞走的气球讲起。这个现象足够日常，学生也容易提出自己的观察：气球为什么会向前飞？空气从哪里出来？飞机那么重，为什么也能前进？借助这样的提问，我逐步引入发动机工作过程的基本逻辑，用较为直观的方式解释进气、压缩、燃烧、排气等环节，并结合图示说明能量如何转化为推动飞行器前进的力量。为了避免知识停留在“听懂了”的层面，我把纸飞机实验和互动问答穿插在讲解中，让学生在观察、猜测和比较中理解飞行并非神秘现象，而是可以通过科学规律解释的过程。</w:t>
-      </w:r>
-    </w:p>
-    <w:p>
-      <w:pPr>
-        <w:pStyle w:val="Normal"/>
-      </w:pPr>
-      <w:r>
-        <w:t xml:space="preserve">第二节“问道”则从飞行中的力学平衡延伸到工程设计。我向学生介绍升力、重力、推力、阻力等概念，并尝试用纸飞机的不同折法和飞行效果帮助大家感受“设计选择会带来不同结果”。在谈到航空发动机涡轮叶片时，我没有把重点放在复杂计算上，而是引导学生思考：发动机内部温度很高，材料为什么不会立刻损坏？工程师如何在安全、效率、重量和成本之间做选择？随后，我简要介绍人工智能可以帮助工程师在大量设计方案中进行筛选和优化。这样做并不是要把“人工智能”包装成万能答案，而是希望学生理解：科技进步往往来自许多人的持续研究、试验、修正和合作。</w:t>
-      </w:r>
-    </w:p>
-    <w:p>
-      <w:pPr>
-        <w:pStyle w:val="Normal"/>
-      </w:pPr>
-      <w:r>
-        <w:t xml:space="preserve">课堂上的互动反馈给我留下了深刻印象。有的同学对发动机工作过程充满好奇，会追问“飞机起飞时为什么声音特别大”；有的同学在折纸飞机时不断调整机翼形状，希望让它飞得更远；也有同学起初不太敢发言，但在小组讨论和实验环节逐渐愿意表达自己的猜测。这样的变化让我意识到，科普课堂的价值不只是传递一个正确结论，更在于允许学生提出不成熟的问题、经历试错、感受探索的乐趣。作为志愿者，我需要做的不是迅速给出标准答案，而是认真接住问题，帮助学生把“我不知道”变成“我想弄明白”。</w:t>
-      </w:r>
-    </w:p>
-    <w:p>
-      <w:pPr>
-        <w:pStyle w:val="Heading2"/>
-      </w:pPr>
-      <w:r>
-        <w:t xml:space="preserve">三、英语话剧排练：让语言学习回到表达与合作</w:t>
-      </w:r>
-    </w:p>
-    <w:p>
-      <w:pPr>
-        <w:pStyle w:val="Normal"/>
-      </w:pPr>
-      <w:r>
-        <w:t xml:space="preserve">除航空发动机课程外，我还与队友组织初二学生排练《龟兔赛跑》《丑小鸭》等经典英语话剧。与单纯背诵单词或朗读课文相比，话剧排练更强调情境、合作和表达。学生需要自主分配角色，反复熟悉台词，调整语气和节奏，再配合动作、表情与同伴完成一个完整片段。最开始，一些同学担心发音不准确，不愿意大声开口；还有同学觉得表演动作“太夸张”，不敢站到同学面前。我们没有急于要求他们做到标准化的表演，而是先营造轻松、安全的氛围，让大家从简单的角色模仿、分组练习开始，逐渐在笑声中放下紧张。</w:t>
-      </w:r>
-    </w:p>
-    <w:p>
-      <w:pPr>
-        <w:pStyle w:val="Normal"/>
-      </w:pPr>
-      <w:r>
-        <w:t xml:space="preserve">排练过程使我更直观地理解了教育中的“参与感”。当学生只是坐在座位上听讲时，他可能把英语看作一门需要完成任务的学科；当他要为角色设计动作、与搭档衔接台词、面对同学完成表演时，语言就成为表达想法、建立合作的工具。我们看到有的同学从一开始低声念台词，到后来能够主动加上表情和动作；有的同学会帮助伙伴记住台词，也会在出现失误时一起想办法补救。这样的课堂未必能在短时间内显著改变成绩，却能够让学生体验到“我可以开口”“我可以与他人合作”“我也能完成一段英语表演”的成就感。这种自信和参与意识，正是成长中十分重要的部分。</w:t>
-      </w:r>
-    </w:p>
-    <w:p>
-      <w:pPr>
-        <w:pStyle w:val="Normal"/>
-      </w:pPr>
-      <w:r>
-        <w:t xml:space="preserve">对我而言，组织话剧也锻炼了临场协调能力。课堂设计在纸面上看起来完整，但真正面对学生时，时间安排、人员状态、场地条件和学生兴趣都会带来变化。志愿者需要及时调整节奏：当某个小组排练遇到困难时，给予更具体的示范；当课堂氛围过于兴奋时，重新明确分工和时间节点；当有人羞于表现时，以鼓励而非强迫的方式邀请他参与。实践让我明白，好的组织不是把每个人都推向同一种表现方式，而是让不同性格、不同基础的学生都能找到适合自己的参与位置。</w:t>
-      </w:r>
-    </w:p>
-    <w:p>
-      <w:pPr>
-        <w:pStyle w:val="Heading2"/>
-      </w:pPr>
-      <w:r>
-        <w:t xml:space="preserve">四、在真实服务中理解青年责任与思政实践的意义</w:t>
-      </w:r>
-    </w:p>
-    <w:p>
-      <w:pPr>
-        <w:pStyle w:val="Normal"/>
-      </w:pPr>
-      <w:r>
-        <w:t xml:space="preserve">此次实践也是一次思想政治理论课实践教学。过去，我对“实践育人”的理解更多停留在概念层面，认为它是在课堂理论之外增加社会体验。而这次在九峰中学的服务使我认识到，理论只有进入具体的人、具体的问题和具体的行动中，才能真正转化为认识世界和改造世界的能力。志愿服务让我看见教育资源、成长环境和信息视野在不同地区、不同学生之间可能存在差异，也让我看见每一个学生身上同样存在的好奇心、创造力和对未来的期待。</w:t>
-      </w:r>
-    </w:p>
-    <w:p>
-      <w:pPr>
-        <w:pStyle w:val="Normal"/>
-      </w:pPr>
-      <w:r>
-        <w:t xml:space="preserve">作为能源与动力工程专业学生，我尤其感受到专业学习与社会服务之间并不遥远。工程知识当然要追求准确与严谨，但其最终价值也在于服务人的发展和社会需要。把航空发动机、飞行原理和人工智能设计讲给中学生听，是一次小小的尝试：我并没有因为自己掌握了某些知识就处于“给予者”的高位，而是在不断思考如何把专业内容转化为学生听得懂、愿意问的语言。这个过程迫使我重新审视自己的专业学习：如果不能向普通人清楚说明一个专业问题，如果不能理解技术与社会需求的联系，那么所谓知识的掌握仍然是不完整的。</w:t>
-      </w:r>
-    </w:p>
-    <w:p>
-      <w:pPr>
-        <w:pStyle w:val="Normal"/>
-      </w:pPr>
-      <w:r>
-        <w:t xml:space="preserve">实践还让我更加理解志愿服务精神中的“奉献、友爱、互助、进步”。奉献并不等于自我感动，而是认真准备每一页课件、认真回应每一个问题、认真遵守服务场景的规则；友爱不是一句口号，而是尊重学生的节奏、理解同伴的困难、在团队中主动补位；互助体现在志愿者之间的分工协作，也体现在学生之间愿意互相提醒、互相鼓励；进步则来自每一次活动后的复盘——哪些环节学生更投入，哪些解释仍然过于抽象，哪些课程资源可以在下一次做得更好。</w:t>
-      </w:r>
-    </w:p>
-    <w:p>
-      <w:pPr>
-        <w:pStyle w:val="Heading2"/>
-      </w:pPr>
-      <w:r>
-        <w:t xml:space="preserve">五、问题反思与政策建议</w:t>
-      </w:r>
-    </w:p>
-    <w:p>
-      <w:pPr>
-        <w:pStyle w:val="Normal"/>
-      </w:pPr>
-      <w:r>
-        <w:t xml:space="preserve">在实践中，我也看到一些需要持续改进的地方。第一，短期夏令营具有很强的氛围感和集中性，但课程结束后如何保持联系、如何让兴趣转化为长期学习动力，仍需要更加稳定的机制。第二，志愿者的专业背景、授课经验和课堂管理能力并不完全相同，若缺乏充分的岗前磨课和教学设计交流，课程质量容易出现差异。第三，活动效果不能只凭现场热闹或合影判断，应建立更轻量、尊重学生的反馈方式，了解学生真正喜欢什么、听懂了什么、希望下一次学什么。</w:t>
-      </w:r>
-    </w:p>
-    <w:p>
-      <w:pPr>
-        <w:pStyle w:val="Normal"/>
-      </w:pPr>
-      <w:r>
-        <w:t xml:space="preserve">基于上述观察，我提出以下建议。</w:t>
-      </w:r>
-    </w:p>
-    <w:p>
-      <w:pPr>
-        <w:pStyle w:val="Normal"/>
-      </w:pPr>
-      <w:r>
-        <w:t xml:space="preserve">其一，建立高校与乡镇学校之间可持续的“暑期夏令营+学期线上陪伴”衔接机制。夏令营可作为激发兴趣和建立关系的起点，后续通过线上答疑、阅读分享、学习经验交流或科普微课等形式保持适度联系，使短期活动转化为长期支持。</w:t>
-      </w:r>
-    </w:p>
-    <w:p>
-      <w:pPr>
-        <w:pStyle w:val="Normal"/>
-      </w:pPr>
-      <w:r>
-        <w:t xml:space="preserve">其二，完善志愿者课程资源库与岗前培训。对航空、能源、化学、心理、艺术、英语等课程，可沉淀经过实践检验的教案、课件、互动案例、实验安全提示和课堂反馈表。新一届志愿者不必从零开始，也可以在既有基础上继续迭代。同时，应加强未成年人保护、沟通边界、课堂安全和突发情况处理培训。</w:t>
-      </w:r>
-    </w:p>
-    <w:p>
-      <w:pPr>
-        <w:pStyle w:val="Normal"/>
-      </w:pPr>
-      <w:r>
-        <w:t xml:space="preserve">其三，鼓励高校学生发挥专业特长，但坚持“以学生为中心”的转化原则。科普课程不应追求知识难度，而应从生活现象切入，设置可参与的实验、讨论和创作环节。对于不同年龄段学生，应采用不同的表达与难度梯度，避免把大学课堂简单压缩后搬到中学。</w:t>
-      </w:r>
-    </w:p>
-    <w:p>
-      <w:pPr>
-        <w:pStyle w:val="Normal"/>
-      </w:pPr>
-      <w:r>
-        <w:t xml:space="preserve">其四，建立多元的活动评价机制。除了记录参与人数和服务时长，也应通过匿名小问卷、心愿卡、课程作品、教师观察和志愿者复盘等方式，评估学生的参与感、理解度和兴趣变化。这样既能改进课程，也能避免志愿服务被简单数字化、形式化。</w:t>
-      </w:r>
-    </w:p>
-    <w:p>
-      <w:pPr>
-        <w:pStyle w:val="Normal"/>
-      </w:pPr>
-      <w:r>
-        <w:t xml:space="preserve">其五，进一步加强学校、书院、公益组织和当地学校之间的协同。高校志愿服务项目既需要青年学生的热情，也需要稳定的指导、资源对接和风险管理。通过明确联络人、提前沟通需求、共同确认课程安排和安全要求，能够使服务更贴近当地学校实际，也让学生志愿者在规范中成长。</w:t>
-      </w:r>
-    </w:p>
-    <w:p>
-      <w:pPr>
-        <w:pStyle w:val="Heading2"/>
-      </w:pPr>
-      <w:r>
-        <w:t xml:space="preserve">六、结语</w:t>
-      </w:r>
-    </w:p>
-    <w:p>
-      <w:pPr>
-        <w:pStyle w:val="Normal"/>
-      </w:pPr>
-      <w:r>
-        <w:t xml:space="preserve">六天的九峰夏令营已经结束，但它留给我的并不是一段可以迅速概括的“实践经历”。从准备“御风记”的课件，到和学生一起折纸飞机、排练英语话剧、交流对未来的想象，我更加清楚地认识到：教育的力量常常不在于一次讲授给出了多少答案，而在于某个问题被认真提出、某份兴趣被允许生长、某个原本不敢开口的学生愿意走到台前。</w:t>
-      </w:r>
-    </w:p>
-    <w:p>
-      <w:pPr>
-        <w:pStyle w:val="Normal"/>
-      </w:pPr>
-      <w:r>
-        <w:t xml:space="preserve">今后，我会继续提升自己的专业素养和表达能力，把在本次实践中获得的经验带回日常学习，也在后续志愿服务中更加重视长期性、专业性和服务对象的真实需求。作为新时代青年，我愿意以更踏实的行动把个人所学同社会需要结合起来，在服务他人、服务基层、服务社会的过程中理解责任、磨炼能力、坚定理想。对我而言，“知行秦川，梦启今夏”不仅是一段夏日记忆，更是一堂关于责任、沟通、专业与成长的实践课。</w:t>
+        <w:t xml:space="preserve">实践活动总结（不少于2000字）</w:t>
+      </w:r>
+    </w:p>
+    <w:p>
+      <w:pPr>
+        <w:pStyle w:val="Normal"/>
+      </w:pPr>
+      <w:r>
+        <w:t xml:space="preserve">2026年暑假，我参加西安交通大学英仔爱心社“知行秦川，梦启今夏”周至九峰分队，在周至县九峰初级中学开展为期六天的暑期夏令营志愿服务。团队围绕破冰互动、学科科普、艺术体育、手工实践和课后交流等内容，为45名学生组织多元课堂。我主要负责“御风记”航空发动机科普课程的设计与讲授，并与队友共同组织初二学生排练《龟兔赛跑》《丑小鸭》等英语话剧。出发前，我以为自己的任务主要是把专业知识讲清楚；真正走进教室后，我逐渐认识到，志愿服务不是把大学课堂简单搬到乡镇中学，更重要的是从学生的生活经验出发，帮助他们产生提问、表达和探索的愿望。</w:t>
+      </w:r>
+    </w:p>
+    <w:p>
+      <w:pPr>
+        <w:pStyle w:val="Normal"/>
+      </w:pPr>
+      <w:r>
+        <w:t xml:space="preserve">我设计的“御风记”分为“驭火”和“问道”两节课。航空发动机涉及热力学、流体力学、材料与机械等多方面知识，如果直接介绍专业术语，很容易让中学生感到遥远。因此，在备课时我把课程目标确定为：不追求在短时间内讲完复杂知识，而是让学生发现科学与生活、工程与想象之间的联系。第一节课从松手后会飞走的气球讲起。学生对这个现象并不陌生，但当问题被提出——气球为什么向前飞、空气从哪里出来、飞机为什么也能获得前进的力量——大家开始主动思考。我顺着这些问题，结合图示介绍发动机进气、压缩、燃烧、排气等基本过程，说明能量如何转化为推动飞行器前进的力量。</w:t>
+      </w:r>
+    </w:p>
+    <w:p>
+      <w:pPr>
+        <w:pStyle w:val="Normal"/>
+      </w:pPr>
+      <w:r>
+        <w:t xml:space="preserve">为了避免课堂变成单向讲授，我把纸飞机实验、抢答和小组讨论穿插进课程。学生会比较不同折法的纸飞机，猜测机翼、重量和飞行距离的关系；有同学会追问飞机起飞时为什么声音很大，也有人对发动机内部高温环境表现出好奇。第二节“问道”中，我从飞行中的升力、重力、推力和阻力讲起，进一步引导学生理解工程设计不是只求一个“最强”的答案，而是在安全、效率、重量、成本等条件之间不断作出选择。我还简要介绍了人工智能能够帮助工程师从大量方案中筛选和优化设计。这里的重点不是把人工智能说成万能工具，而是让学生知道，科技进步来自持续学习、反复试验和团队协作。</w:t>
+      </w:r>
+    </w:p>
+    <w:p>
+      <w:pPr>
+        <w:pStyle w:val="Normal"/>
+      </w:pPr>
+      <w:r>
+        <w:t xml:space="preserve">课堂反馈使我对“科普”有了更具体的理解。原来，学生不一定需要马上掌握完整的公式和原理，他们更需要在一个不害怕出错的环境里把问题说出来。刚开始有些同学不愿发言，担心答案不正确；在纸飞机实验和小组交流中，他们逐渐愿意讲出自己的猜测。作为志愿者，我也学习到不能急于给出标准答案，而应认真接住问题，帮助学生观察、比较、推理。一次成功的科普课，不只是让学生记住几个知识点，更是在他们心中留下“原来我也能理解科学、我也可以继续追问”的体验。</w:t>
+      </w:r>
+    </w:p>
+    <w:p>
+      <w:pPr>
+        <w:pStyle w:val="Normal"/>
+      </w:pPr>
+      <w:r>
+        <w:t xml:space="preserve">英语话剧排练带给我另一种收获。我和队友组织学生排练《龟兔赛跑》《丑小鸭》，引导大家分配角色、练习台词、调整语气并配合动作。最初，一些同学担心发音不准确，也不愿意在大家面前做夸张动作。我们没有要求他们立刻完成标准化表演，而是先从分组朗读、模仿角色和简单互动开始，尽量营造轻松、安全的氛围。随着排练推进，原本声音很小的同学开始愿意大声说台词，有的同学主动帮伙伴记忆内容，也有人在失误后和组员一起补救。话剧使英语不再只是课本中的单词和句子，而成为表达想法、和同伴合作的一种工具。</w:t>
+      </w:r>
+    </w:p>
+    <w:p>
+      <w:pPr>
+        <w:pStyle w:val="Normal"/>
+      </w:pPr>
+      <w:r>
+        <w:t xml:space="preserve">这段经历也让我认识到，教育活动的价值不一定只体现在短期成绩上。学生在科学实验中提出问题、在话剧中开口表达、在小组合作中互相鼓励，这些看似细小的变化同样重要。志愿者要尊重不同学生的基础和性格，不能把自己的表达方式强加给他们。课堂设计再完整，也需要在现场根据学生状态调整节奏：当内容太抽象时，用生活化例子重新解释；当气氛过于兴奋时，重新明确分工；当有人不愿表现时，用鼓励而不是强迫邀请其参与。对我来说，这种临场观察、沟通协调和责任意识，是书本学习难以完全提供的能力。</w:t>
+      </w:r>
+    </w:p>
+    <w:p>
+      <w:pPr>
+        <w:pStyle w:val="Normal"/>
+      </w:pPr>
+      <w:r>
+        <w:t xml:space="preserve">作为思想政治理论课实践教学的一部分，此次经历让我对“实践育人”有了更深理解。过去，我把社会实践理解为课堂之外的体验；现在我认识到，理论只有进入具体的人、具体的问题和具体行动中，才会转化为认识社会和服务社会的能力。九峰中学的学生与我们有不同的成长环境和资源条件，但他们同样拥有强烈的好奇心、创造力和对未来的期待。志愿服务不应是居高临下的“给予”，而应是平等的交流和长期的陪伴。大学生带去的不只是课程内容，也应带去尊重、耐心和对每个学生成长可能性的相信。</w:t>
+      </w:r>
+    </w:p>
+    <w:p>
+      <w:pPr>
+        <w:pStyle w:val="Normal"/>
+      </w:pPr>
+      <w:r>
+        <w:t xml:space="preserve">我的专业是能源与动力工程。通过这次课程设计，我更加感到专业学习与社会需要并不遥远。工程知识需要准确、严谨，也需要能够被普通人理解；如果不能把一个专业问题讲清楚，不能看见技术与人的生活、国家发展之间的联系，对知识的掌握就是不完整的。把航空发动机知识转化为适合中学生的课堂，是一次专业表达的训练，也让我更加珍惜今后的专业学习。我希望自己继续提高理论基础和实践能力，在未来用更扎实的知识服务社会。</w:t>
+      </w:r>
+    </w:p>
+    <w:p>
+      <w:pPr>
+        <w:pStyle w:val="Normal"/>
+      </w:pPr>
+      <w:r>
+        <w:t xml:space="preserve">实践中也有值得改进之处。第一，暑期夏令营时间有限，短期活动如何与学期中的线上助学、阅读交流或科普答疑衔接，需要更稳定的机制。第二，志愿者的专业背景和授课经验不同，应在出发前安排更充分的磨课、试讲、课堂管理和未成年人保护培训。第三，活动效果不能只看参与人数和现场气氛，还应通过心愿卡、简短反馈、课程作品和教师观察，了解学生真正喜欢什么、理解了什么、下一次希望学习什么。</w:t>
+      </w:r>
+    </w:p>
+    <w:p>
+      <w:pPr>
+        <w:pStyle w:val="Normal"/>
+      </w:pPr>
+      <w:r>
+        <w:t xml:space="preserve">对此，我建议：一是建立“暑期夏令营+学期线上陪伴”的持续机制，让夏令营成为长期支持的起点；二是沉淀科普、英语、美育、心理等课程资源库，保留教案、互动案例、安全提示和复盘记录，方便后续志愿者迭代；三是按照学生年龄和基础设计不同难度的课程，更多使用实验、创作、讨论等参与式方法；四是加强学校、书院、公益组织和当地学校之间的沟通，提前明确课程需求、活动流程和安全责任；五是建立尊重学生隐私和主体性的宣传原则，让服务记录真实而有分寸。</w:t>
+      </w:r>
+    </w:p>
+    <w:p>
+      <w:pPr>
+        <w:pStyle w:val="Normal"/>
+      </w:pPr>
+      <w:r>
+        <w:t xml:space="preserve">六天的夏令营结束了，但它留给我的不只是一次志愿经历。从准备课件、讲解飞行原理，到和学生一起折纸飞机、排练话剧、交流对未来的想象，我更加理解了责任、沟通和陪伴的意义。今后，我会继续提升专业素养和表达能力，把个人所学与社会需要结合起来，在服务他人、服务基层的过程中磨炼本领、坚定理想。对我而言，“知行秦川，梦启今夏”是一堂真实的实践课：它让我看见教育的温度，也提醒我以更踏实的行动回应青年应有的担当。</w:t>
       </w:r>
     </w:p>
     <w:p>

</xml_diff>

<commit_message>
personalize Sun Chengze practice summary
Co-authored-by: arena-agent <297053741+arena-agent@users.noreply.github.com>
</commit_message>
<xml_diff>
--- a/deliverables/孙承泽-思政课实践教学活动记录册_填报稿.docx
+++ b/deliverables/孙承泽-思政课实践教学活动记录册_填报稿.docx
@@ -143,87 +143,111 @@
         <w:pStyle w:val="Normal"/>
       </w:pPr>
       <w:r>
-        <w:t xml:space="preserve">2026年暑假，我参加西安交通大学英仔爱心社“知行秦川，梦启今夏”周至九峰分队，在周至县九峰初级中学开展为期六天的暑期夏令营志愿服务。团队围绕破冰互动、学科科普、艺术体育、手工实践和课后交流等内容，为45名学生组织多元课堂。我主要负责“御风记”航空发动机科普课程的设计与讲授，并与队友共同组织初二学生排练《龟兔赛跑》《丑小鸭》等英语话剧。出发前，我以为自己的任务主要是把专业知识讲清楚；真正走进教室后，我逐渐认识到，志愿服务不是把大学课堂简单搬到乡镇中学，更重要的是从学生的生活经验出发，帮助他们产生提问、表达和探索的愿望。</w:t>
-      </w:r>
-    </w:p>
-    <w:p>
-      <w:pPr>
-        <w:pStyle w:val="Normal"/>
-      </w:pPr>
-      <w:r>
-        <w:t xml:space="preserve">我设计的“御风记”分为“驭火”和“问道”两节课。航空发动机涉及热力学、流体力学、材料与机械等多方面知识，如果直接介绍专业术语，很容易让中学生感到遥远。因此，在备课时我把课程目标确定为：不追求在短时间内讲完复杂知识，而是让学生发现科学与生活、工程与想象之间的联系。第一节课从松手后会飞走的气球讲起。学生对这个现象并不陌生，但当问题被提出——气球为什么向前飞、空气从哪里出来、飞机为什么也能获得前进的力量——大家开始主动思考。我顺着这些问题，结合图示介绍发动机进气、压缩、燃烧、排气等基本过程，说明能量如何转化为推动飞行器前进的力量。</w:t>
-      </w:r>
-    </w:p>
-    <w:p>
-      <w:pPr>
-        <w:pStyle w:val="Normal"/>
-      </w:pPr>
-      <w:r>
-        <w:t xml:space="preserve">为了避免课堂变成单向讲授，我把纸飞机实验、抢答和小组讨论穿插进课程。学生会比较不同折法的纸飞机，猜测机翼、重量和飞行距离的关系；有同学会追问飞机起飞时为什么声音很大，也有人对发动机内部高温环境表现出好奇。第二节“问道”中，我从飞行中的升力、重力、推力和阻力讲起，进一步引导学生理解工程设计不是只求一个“最强”的答案，而是在安全、效率、重量、成本等条件之间不断作出选择。我还简要介绍了人工智能能够帮助工程师从大量方案中筛选和优化设计。这里的重点不是把人工智能说成万能工具，而是让学生知道，科技进步来自持续学习、反复试验和团队协作。</w:t>
-      </w:r>
-    </w:p>
-    <w:p>
-      <w:pPr>
-        <w:pStyle w:val="Normal"/>
-      </w:pPr>
-      <w:r>
-        <w:t xml:space="preserve">课堂反馈使我对“科普”有了更具体的理解。原来，学生不一定需要马上掌握完整的公式和原理，他们更需要在一个不害怕出错的环境里把问题说出来。刚开始有些同学不愿发言，担心答案不正确；在纸飞机实验和小组交流中，他们逐渐愿意讲出自己的猜测。作为志愿者，我也学习到不能急于给出标准答案，而应认真接住问题，帮助学生观察、比较、推理。一次成功的科普课，不只是让学生记住几个知识点，更是在他们心中留下“原来我也能理解科学、我也可以继续追问”的体验。</w:t>
-      </w:r>
-    </w:p>
-    <w:p>
-      <w:pPr>
-        <w:pStyle w:val="Normal"/>
-      </w:pPr>
-      <w:r>
-        <w:t xml:space="preserve">英语话剧排练带给我另一种收获。我和队友组织学生排练《龟兔赛跑》《丑小鸭》，引导大家分配角色、练习台词、调整语气并配合动作。最初，一些同学担心发音不准确，也不愿意在大家面前做夸张动作。我们没有要求他们立刻完成标准化表演，而是先从分组朗读、模仿角色和简单互动开始，尽量营造轻松、安全的氛围。随着排练推进，原本声音很小的同学开始愿意大声说台词，有的同学主动帮伙伴记忆内容，也有人在失误后和组员一起补救。话剧使英语不再只是课本中的单词和句子，而成为表达想法、和同伴合作的一种工具。</w:t>
-      </w:r>
-    </w:p>
-    <w:p>
-      <w:pPr>
-        <w:pStyle w:val="Normal"/>
-      </w:pPr>
-      <w:r>
-        <w:t xml:space="preserve">这段经历也让我认识到，教育活动的价值不一定只体现在短期成绩上。学生在科学实验中提出问题、在话剧中开口表达、在小组合作中互相鼓励，这些看似细小的变化同样重要。志愿者要尊重不同学生的基础和性格，不能把自己的表达方式强加给他们。课堂设计再完整，也需要在现场根据学生状态调整节奏：当内容太抽象时，用生活化例子重新解释；当气氛过于兴奋时，重新明确分工；当有人不愿表现时，用鼓励而不是强迫邀请其参与。对我来说，这种临场观察、沟通协调和责任意识，是书本学习难以完全提供的能力。</w:t>
-      </w:r>
-    </w:p>
-    <w:p>
-      <w:pPr>
-        <w:pStyle w:val="Normal"/>
-      </w:pPr>
-      <w:r>
-        <w:t xml:space="preserve">作为思想政治理论课实践教学的一部分，此次经历让我对“实践育人”有了更深理解。过去，我把社会实践理解为课堂之外的体验；现在我认识到，理论只有进入具体的人、具体的问题和具体行动中，才会转化为认识社会和服务社会的能力。九峰中学的学生与我们有不同的成长环境和资源条件，但他们同样拥有强烈的好奇心、创造力和对未来的期待。志愿服务不应是居高临下的“给予”，而应是平等的交流和长期的陪伴。大学生带去的不只是课程内容，也应带去尊重、耐心和对每个学生成长可能性的相信。</w:t>
-      </w:r>
-    </w:p>
-    <w:p>
-      <w:pPr>
-        <w:pStyle w:val="Normal"/>
-      </w:pPr>
-      <w:r>
-        <w:t xml:space="preserve">我的专业是能源与动力工程。通过这次课程设计，我更加感到专业学习与社会需要并不遥远。工程知识需要准确、严谨，也需要能够被普通人理解；如果不能把一个专业问题讲清楚，不能看见技术与人的生活、国家发展之间的联系，对知识的掌握就是不完整的。把航空发动机知识转化为适合中学生的课堂，是一次专业表达的训练，也让我更加珍惜今后的专业学习。我希望自己继续提高理论基础和实践能力，在未来用更扎实的知识服务社会。</w:t>
-      </w:r>
-    </w:p>
-    <w:p>
-      <w:pPr>
-        <w:pStyle w:val="Normal"/>
-      </w:pPr>
-      <w:r>
-        <w:t xml:space="preserve">实践中也有值得改进之处。第一，暑期夏令营时间有限，短期活动如何与学期中的线上助学、阅读交流或科普答疑衔接，需要更稳定的机制。第二，志愿者的专业背景和授课经验不同，应在出发前安排更充分的磨课、试讲、课堂管理和未成年人保护培训。第三，活动效果不能只看参与人数和现场气氛，还应通过心愿卡、简短反馈、课程作品和教师观察，了解学生真正喜欢什么、理解了什么、下一次希望学习什么。</w:t>
-      </w:r>
-    </w:p>
-    <w:p>
-      <w:pPr>
-        <w:pStyle w:val="Normal"/>
-      </w:pPr>
-      <w:r>
-        <w:t xml:space="preserve">对此，我建议：一是建立“暑期夏令营+学期线上陪伴”的持续机制，让夏令营成为长期支持的起点；二是沉淀科普、英语、美育、心理等课程资源库，保留教案、互动案例、安全提示和复盘记录，方便后续志愿者迭代；三是按照学生年龄和基础设计不同难度的课程，更多使用实验、创作、讨论等参与式方法；四是加强学校、书院、公益组织和当地学校之间的沟通，提前明确课程需求、活动流程和安全责任；五是建立尊重学生隐私和主体性的宣传原则，让服务记录真实而有分寸。</w:t>
-      </w:r>
-    </w:p>
-    <w:p>
-      <w:pPr>
-        <w:pStyle w:val="Normal"/>
-      </w:pPr>
-      <w:r>
-        <w:t xml:space="preserve">六天的夏令营结束了，但它留给我的不只是一次志愿经历。从准备课件、讲解飞行原理，到和学生一起折纸飞机、排练话剧、交流对未来的想象，我更加理解了责任、沟通和陪伴的意义。今后，我会继续提升专业素养和表达能力，把个人所学与社会需要结合起来，在服务他人、服务基层的过程中磨炼本领、坚定理想。对我而言，“知行秦川，梦启今夏”是一堂真实的实践课：它让我看见教育的温度，也提醒我以更踏实的行动回应青年应有的担当。</w:t>
+        <w:t xml:space="preserve">2026年暑假，我参加了西安交通大学英仔爱心社“知行秦川，梦启今夏”周至九峰中学暑期夏令营。本次活动中，我们宣传部第二小组由孙承泽、穆思雨、董懿三人组成，在前卫部组织的周至支教活动中承担授课、助教、摄影和视频记录等工作。短短六天里，我们既走上讲台，也穿梭在课堂、操场和活动现场之间。这段实践让我感受到，志愿服务不只是完成一节课程或一次拍摄任务，而是在共同协作中陪伴学生、记录成长，也重新理解自己能够为集体做些什么。</w:t>
+      </w:r>
+    </w:p>
+    <w:p>
+      <w:pPr>
+        <w:pStyle w:val="Normal"/>
+      </w:pPr>
+      <w:r>
+        <w:t xml:space="preserve">小组最主要的教学任务是英语课，共四节：初二两节、初三两节。其中，初二两节由我主讲，分别是英语话剧课和英语游戏课；初三两节由穆思雨主讲，我和董懿担任助教。相比之前对支教课堂的想象，我印象最深的不是“把知识讲完”，而是如何让学生愿意参与、愿意开口。英语课如果只停留在词汇、语法和朗读上，学生很容易把它理解为又一堂需要完成任务的课程。因此，我们在准备时希望把英语学习同角色、游戏、合作联系起来，让学生在轻松的氛围中感受语言的实际用途。</w:t>
+      </w:r>
+    </w:p>
+    <w:p>
+      <w:pPr>
+        <w:pStyle w:val="Normal"/>
+      </w:pPr>
+      <w:r>
+        <w:t xml:space="preserve">第一节初二英语话剧课中，我带领学生围绕《龟兔赛跑》《丑小鸭》等经典故事进行角色分配、台词练习和简单表演。学生们起初多少有些拘谨，有人担心发音不够好，有人不愿意做太夸张的动作。于是我没有急着要求他们完成正式表演，而是先让大家分组朗读、熟悉角色，再逐步加入语气、动作和同伴配合。随着活动推进，原本声音较小的同学开始愿意开口，有些同学还会主动帮助同伴记住台词、调整节奏。看到他们在笑声中完成角色表达，我更加认识到，语言学习不仅是记住正确答案，也可以成为建立自信、与他人合作的一种方式。</w:t>
+      </w:r>
+    </w:p>
+    <w:p>
+      <w:pPr>
+        <w:pStyle w:val="Normal"/>
+      </w:pPr>
+      <w:r>
+        <w:t xml:space="preserve">第二节初二英语游戏课则更强调互动性。我带领大家完成多项英语小游戏，把单词、表达和反应练习放进小组协作和轻松竞争中。课堂上，学生需要认真听指令、快速作出反应，也需要和伙伴沟通、互相提醒。虽然游戏本身不复杂，但它让原本可能枯燥的英语练习有了参与感。学生在活动中会因为答对而兴奋，也会在出现失误时互相鼓励。对我来说，这节课让我体会到，课堂设计不必一味追求复杂，只要目标明确、节奏合适、每个人都有参与机会，就能让学生在快乐中完成学习。</w:t>
+      </w:r>
+    </w:p>
+    <w:p>
+      <w:pPr>
+        <w:pStyle w:val="Normal"/>
+      </w:pPr>
+      <w:r>
+        <w:t xml:space="preserve">在初三英语课中，穆思雨承担主讲，我和董懿更多承担助教任务，协助维持课堂秩序、观察学生反应、拍摄照片和视频。穆思雨还主讲了心理课，我在这节课中承担旁听助教工作，负责拍摄、纪律协助和现场配合。虽然“助教”听起来不像主讲那样显眼，但这让我看到一堂课顺利进行离不开许多细小的支持：及时关注学生状态、在需要时提醒秩序、保留课堂影像、帮助主讲者应对现场变化。支教不是一个人站在讲台上的展示，而是团队成员彼此补位的过程。每一个人都要根据自己的能力承担责任，才能让课堂和活动保持稳定、自然的节奏。</w:t>
+      </w:r>
+    </w:p>
+    <w:p>
+      <w:pPr>
+        <w:pStyle w:val="Normal"/>
+      </w:pPr>
+      <w:r>
+        <w:t xml:space="preserve">除了英语课，我还负责“御风记”航空发动机科普课。课程分为两部分，我通过网页交互模拟动画演示飞行与发动机相关原理，而不是在现场折叠纸飞机。备课时，我希望尽量避免把大学专业术语直接搬到中学生面前，于是从松手气球等日常现象切入，介绍发动机的基本工作过程、飞行中的力学平衡，以及人工智能如何辅助工程师进行设计优化。交互页面和动画能够把抽象的过程变得更直观：学生可以跟着画面观察不同环节如何衔接，再提出自己的猜测和问题。</w:t>
+      </w:r>
+    </w:p>
+    <w:p>
+      <w:pPr>
+        <w:pStyle w:val="Normal"/>
+      </w:pPr>
+      <w:r>
+        <w:t xml:space="preserve">这节课让我体会到，专业科普的重点不在于在有限时间内讲多少难度很高的知识，而在于能否引起学生的好奇心。有同学会问飞机为什么能飞得那么远，有同学会关注发动机里高温材料的问题。面对这些问题，我尽量用他们能理解的语言说明，同时也坦诚指出有些复杂内容需要在今后的学习中继续探索。作为能源与动力工程专业学生，我通过这次授课进一步认识到，专业知识不仅要学得准确，也要能够被清楚地表达。只有把技术问题同生活经验、国家发展和人的需求联系起来，专业学习才更有温度和意义。</w:t>
+      </w:r>
+    </w:p>
+    <w:p>
+      <w:pPr>
+        <w:pStyle w:val="Normal"/>
+      </w:pPr>
+      <w:r>
+        <w:t xml:space="preserve">实践期间，有些看似不在“授课任务”里的片段也给我留下了深刻印象。第三天下午的简单游园会中，我带着学生到操场活动，一起打乒乓球、跑步。活动时间并不长，但大家在课堂之外相处得更加放松，学生们的笑声和活力让我感到很快乐。志愿者与学生之间的关系不应只停留在“老师讲、学生听”，在安全、有序的互动中，平等的陪伴同样能拉近距离。</w:t>
+      </w:r>
+    </w:p>
+    <w:p>
+      <w:pPr>
+        <w:pStyle w:val="Normal"/>
+      </w:pPr>
+      <w:r>
+        <w:t xml:space="preserve">第四天下午，我和穆思雨参加了由邱新茹、张艳阳主讲的秦腔艺术脸谱绘画课。我们和学生一起在面具上作画，体验传统艺术中颜色、线条和人物形象的表达。对我而言，这是一段很新奇的经历：我已经很久没有认真画画，在动手创作中重新感受到绘画带来的专注和快乐。更重要的是，我从学生身上看到了他们在课堂中自由想象、互相展示作品时的投入。秦腔脸谱课让我意识到，支教活动不应只围绕知识补充，也可以让学生接触传统文化、艺术表达和动手实践，让他们在不同的体验中发现自己的兴趣。</w:t>
+      </w:r>
+    </w:p>
+    <w:p>
+      <w:pPr>
+        <w:pStyle w:val="Normal"/>
+      </w:pPr>
+      <w:r>
+        <w:t xml:space="preserve">本次活动中，我和董懿还承担了主要摄影任务。我负责视频总协调，拍摄了大量课堂、活动和日常相处的影像，并在活动后剪辑完成一支约五分钟的总结视频。我还带来无人机，在确保安全和不影响活动秩序的前提下进行了一些航拍记录。与单纯拍摄“热闹场面”相比，我更希望视频能保留真实的细节：学生认真听课的神情、排练话剧时的笑声、游园会中的奔跑、老师和志愿者之间的配合。这些片段让我感到，宣传工作并不是活动结束后的附属环节，而是对实践过程的回望、整理和传递。</w:t>
+      </w:r>
+    </w:p>
+    <w:p>
+      <w:pPr>
+        <w:pStyle w:val="Normal"/>
+      </w:pPr>
+      <w:r>
+        <w:t xml:space="preserve">剪辑视频时，我重新观看了许多素材，也重新回忆起这几天的经历。镜头中的每一个片段都不是孤立的：一节顺利的课背后有反复备课和队友配合，一场轻松的游戏背后有秩序维护和耐心引导，一段好看的视频背后有拍摄者对现场的观察和对服务对象的尊重。作为宣传部成员，我更加明确了自己在公益活动中的责任：既要用影像记录真实发生的事，也要注意拍摄和传播的边界，尊重学生隐私，不把任何人的处境当成吸引注意力的素材。</w:t>
+      </w:r>
+    </w:p>
+    <w:p>
+      <w:pPr>
+        <w:pStyle w:val="Normal"/>
+      </w:pPr>
+      <w:r>
+        <w:t xml:space="preserve">此次实践也是一次思想政治理论课实践教学。它让我不再把“服务社会”理解为抽象口号，而是理解为认真完成每一项具体工作：备好一节课、帮助一名同学融入活动、在现场做好安全和秩序配合、如实记录实践过程、和队友共同复盘问题。青年学生的成长不只发生在课堂里，也发生在走进基层、理解不同成长环境、与他人协作解决实际问题的过程中。九峰中学的学生让我看到，他们有丰富的好奇心和对未来的期待；而我们能做的，是用所学知识和真诚陪伴，为这种期待提供一点支持。</w:t>
+      </w:r>
+    </w:p>
+    <w:p>
+      <w:pPr>
+        <w:pStyle w:val="Normal"/>
+      </w:pPr>
+      <w:r>
+        <w:t xml:space="preserve">通过这次实践，我也看到今后可以改进的方向。第一，暑期夏令营时间有限，活动结束后应与线上助学、阅读交流或科普答疑建立适度衔接，让短期陪伴转化为更长期的支持。第二，志愿者应在出发前加强试讲、课堂组织、未成年人保护和影像授权培训，使每一节课和每一次拍摄都更规范。第三，课程效果不能只以人数和现场热闹衡量，还应通过学生作品、课后反馈和教师观察了解他们真正的收获。第四，宣传材料应更多记录学生的成长、团队的协作和项目的长期价值，而不是简单追求感动或流量。</w:t>
+      </w:r>
+    </w:p>
+    <w:p>
+      <w:pPr>
+        <w:pStyle w:val="Normal"/>
+      </w:pPr>
+      <w:r>
+        <w:t xml:space="preserve">六天的周至实践已经结束，但它仍然值得回忆和纪念。英语话剧课中学生逐渐敢于开口的变化、英语游戏里的欢笑、御风记课堂上的提问、秦腔脸谱绘画的专注、游园会短暂而轻松的运动时光，以及剪辑视频时重新浮现的每一个镜头，都让我感受到志愿服务的丰富意义。今后，我会继续提升自己的专业能力、教学表达和影像记录能力，把个人所学同社会需要结合起来，在一次次真实的实践中磨炼本领、承担责任，也把这段夏日经历所带来的温暖和动力延续下去。</w:t>
       </w:r>
     </w:p>
     <w:p>

</xml_diff>

<commit_message>
refine Zhouzhi practice reflection details
Co-authored-by: arena-agent <297053741+arena-agent@users.noreply.github.com>
</commit_message>
<xml_diff>
--- a/deliverables/孙承泽-思政课实践教学活动记录册_填报稿.docx
+++ b/deliverables/孙承泽-思政课实践教学活动记录册_填报稿.docx
@@ -143,111 +143,95 @@
         <w:pStyle w:val="Normal"/>
       </w:pPr>
       <w:r>
-        <w:t xml:space="preserve">2026年暑假，我参加了西安交通大学英仔爱心社“知行秦川，梦启今夏”周至九峰中学暑期夏令营。本次活动中，我们宣传部第二小组由孙承泽、穆思雨、董懿三人组成，在前卫部组织的周至支教活动中承担授课、助教、摄影和视频记录等工作。短短六天里，我们既走上讲台，也穿梭在课堂、操场和活动现场之间。这段实践让我感受到，志愿服务不只是完成一节课程或一次拍摄任务，而是在共同协作中陪伴学生、记录成长，也重新理解自己能够为集体做些什么。</w:t>
-      </w:r>
-    </w:p>
-    <w:p>
-      <w:pPr>
-        <w:pStyle w:val="Normal"/>
-      </w:pPr>
-      <w:r>
-        <w:t xml:space="preserve">小组最主要的教学任务是英语课，共四节：初二两节、初三两节。其中，初二两节由我主讲，分别是英语话剧课和英语游戏课；初三两节由穆思雨主讲，我和董懿担任助教。相比之前对支教课堂的想象，我印象最深的不是“把知识讲完”，而是如何让学生愿意参与、愿意开口。英语课如果只停留在词汇、语法和朗读上，学生很容易把它理解为又一堂需要完成任务的课程。因此，我们在准备时希望把英语学习同角色、游戏、合作联系起来，让学生在轻松的氛围中感受语言的实际用途。</w:t>
-      </w:r>
-    </w:p>
-    <w:p>
-      <w:pPr>
-        <w:pStyle w:val="Normal"/>
-      </w:pPr>
-      <w:r>
-        <w:t xml:space="preserve">第一节初二英语话剧课中，我带领学生围绕《龟兔赛跑》《丑小鸭》等经典故事进行角色分配、台词练习和简单表演。学生们起初多少有些拘谨，有人担心发音不够好，有人不愿意做太夸张的动作。于是我没有急着要求他们完成正式表演，而是先让大家分组朗读、熟悉角色，再逐步加入语气、动作和同伴配合。随着活动推进，原本声音较小的同学开始愿意开口，有些同学还会主动帮助同伴记住台词、调整节奏。看到他们在笑声中完成角色表达，我更加认识到，语言学习不仅是记住正确答案，也可以成为建立自信、与他人合作的一种方式。</w:t>
-      </w:r>
-    </w:p>
-    <w:p>
-      <w:pPr>
-        <w:pStyle w:val="Normal"/>
-      </w:pPr>
-      <w:r>
-        <w:t xml:space="preserve">第二节初二英语游戏课则更强调互动性。我带领大家完成多项英语小游戏，把单词、表达和反应练习放进小组协作和轻松竞争中。课堂上，学生需要认真听指令、快速作出反应，也需要和伙伴沟通、互相提醒。虽然游戏本身不复杂，但它让原本可能枯燥的英语练习有了参与感。学生在活动中会因为答对而兴奋，也会在出现失误时互相鼓励。对我来说，这节课让我体会到，课堂设计不必一味追求复杂，只要目标明确、节奏合适、每个人都有参与机会，就能让学生在快乐中完成学习。</w:t>
-      </w:r>
-    </w:p>
-    <w:p>
-      <w:pPr>
-        <w:pStyle w:val="Normal"/>
-      </w:pPr>
-      <w:r>
-        <w:t xml:space="preserve">在初三英语课中，穆思雨承担主讲，我和董懿更多承担助教任务，协助维持课堂秩序、观察学生反应、拍摄照片和视频。穆思雨还主讲了心理课，我在这节课中承担旁听助教工作，负责拍摄、纪律协助和现场配合。虽然“助教”听起来不像主讲那样显眼，但这让我看到一堂课顺利进行离不开许多细小的支持：及时关注学生状态、在需要时提醒秩序、保留课堂影像、帮助主讲者应对现场变化。支教不是一个人站在讲台上的展示，而是团队成员彼此补位的过程。每一个人都要根据自己的能力承担责任，才能让课堂和活动保持稳定、自然的节奏。</w:t>
-      </w:r>
-    </w:p>
-    <w:p>
-      <w:pPr>
-        <w:pStyle w:val="Normal"/>
-      </w:pPr>
-      <w:r>
-        <w:t xml:space="preserve">除了英语课，我还负责“御风记”航空发动机科普课。课程分为两部分，我通过网页交互模拟动画演示飞行与发动机相关原理，而不是在现场折叠纸飞机。备课时，我希望尽量避免把大学专业术语直接搬到中学生面前，于是从松手气球等日常现象切入，介绍发动机的基本工作过程、飞行中的力学平衡，以及人工智能如何辅助工程师进行设计优化。交互页面和动画能够把抽象的过程变得更直观：学生可以跟着画面观察不同环节如何衔接，再提出自己的猜测和问题。</w:t>
-      </w:r>
-    </w:p>
-    <w:p>
-      <w:pPr>
-        <w:pStyle w:val="Normal"/>
-      </w:pPr>
-      <w:r>
-        <w:t xml:space="preserve">这节课让我体会到，专业科普的重点不在于在有限时间内讲多少难度很高的知识，而在于能否引起学生的好奇心。有同学会问飞机为什么能飞得那么远，有同学会关注发动机里高温材料的问题。面对这些问题，我尽量用他们能理解的语言说明，同时也坦诚指出有些复杂内容需要在今后的学习中继续探索。作为能源与动力工程专业学生，我通过这次授课进一步认识到，专业知识不仅要学得准确，也要能够被清楚地表达。只有把技术问题同生活经验、国家发展和人的需求联系起来，专业学习才更有温度和意义。</w:t>
-      </w:r>
-    </w:p>
-    <w:p>
-      <w:pPr>
-        <w:pStyle w:val="Normal"/>
-      </w:pPr>
-      <w:r>
-        <w:t xml:space="preserve">实践期间，有些看似不在“授课任务”里的片段也给我留下了深刻印象。第三天下午的简单游园会中，我带着学生到操场活动，一起打乒乓球、跑步。活动时间并不长，但大家在课堂之外相处得更加放松，学生们的笑声和活力让我感到很快乐。志愿者与学生之间的关系不应只停留在“老师讲、学生听”，在安全、有序的互动中，平等的陪伴同样能拉近距离。</w:t>
-      </w:r>
-    </w:p>
-    <w:p>
-      <w:pPr>
-        <w:pStyle w:val="Normal"/>
-      </w:pPr>
-      <w:r>
-        <w:t xml:space="preserve">第四天下午，我和穆思雨参加了由邱新茹、张艳阳主讲的秦腔艺术脸谱绘画课。我们和学生一起在面具上作画，体验传统艺术中颜色、线条和人物形象的表达。对我而言，这是一段很新奇的经历：我已经很久没有认真画画，在动手创作中重新感受到绘画带来的专注和快乐。更重要的是，我从学生身上看到了他们在课堂中自由想象、互相展示作品时的投入。秦腔脸谱课让我意识到，支教活动不应只围绕知识补充，也可以让学生接触传统文化、艺术表达和动手实践，让他们在不同的体验中发现自己的兴趣。</w:t>
-      </w:r>
-    </w:p>
-    <w:p>
-      <w:pPr>
-        <w:pStyle w:val="Normal"/>
-      </w:pPr>
-      <w:r>
-        <w:t xml:space="preserve">本次活动中，我和董懿还承担了主要摄影任务。我负责视频总协调，拍摄了大量课堂、活动和日常相处的影像，并在活动后剪辑完成一支约五分钟的总结视频。我还带来无人机，在确保安全和不影响活动秩序的前提下进行了一些航拍记录。与单纯拍摄“热闹场面”相比，我更希望视频能保留真实的细节：学生认真听课的神情、排练话剧时的笑声、游园会中的奔跑、老师和志愿者之间的配合。这些片段让我感到，宣传工作并不是活动结束后的附属环节，而是对实践过程的回望、整理和传递。</w:t>
-      </w:r>
-    </w:p>
-    <w:p>
-      <w:pPr>
-        <w:pStyle w:val="Normal"/>
-      </w:pPr>
-      <w:r>
-        <w:t xml:space="preserve">剪辑视频时，我重新观看了许多素材，也重新回忆起这几天的经历。镜头中的每一个片段都不是孤立的：一节顺利的课背后有反复备课和队友配合，一场轻松的游戏背后有秩序维护和耐心引导，一段好看的视频背后有拍摄者对现场的观察和对服务对象的尊重。作为宣传部成员，我更加明确了自己在公益活动中的责任：既要用影像记录真实发生的事，也要注意拍摄和传播的边界，尊重学生隐私，不把任何人的处境当成吸引注意力的素材。</w:t>
-      </w:r>
-    </w:p>
-    <w:p>
-      <w:pPr>
-        <w:pStyle w:val="Normal"/>
-      </w:pPr>
-      <w:r>
-        <w:t xml:space="preserve">此次实践也是一次思想政治理论课实践教学。它让我不再把“服务社会”理解为抽象口号，而是理解为认真完成每一项具体工作：备好一节课、帮助一名同学融入活动、在现场做好安全和秩序配合、如实记录实践过程、和队友共同复盘问题。青年学生的成长不只发生在课堂里，也发生在走进基层、理解不同成长环境、与他人协作解决实际问题的过程中。九峰中学的学生让我看到，他们有丰富的好奇心和对未来的期待；而我们能做的，是用所学知识和真诚陪伴，为这种期待提供一点支持。</w:t>
-      </w:r>
-    </w:p>
-    <w:p>
-      <w:pPr>
-        <w:pStyle w:val="Normal"/>
-      </w:pPr>
-      <w:r>
-        <w:t xml:space="preserve">通过这次实践，我也看到今后可以改进的方向。第一，暑期夏令营时间有限，活动结束后应与线上助学、阅读交流或科普答疑建立适度衔接，让短期陪伴转化为更长期的支持。第二，志愿者应在出发前加强试讲、课堂组织、未成年人保护和影像授权培训，使每一节课和每一次拍摄都更规范。第三，课程效果不能只以人数和现场热闹衡量，还应通过学生作品、课后反馈和教师观察了解他们真正的收获。第四，宣传材料应更多记录学生的成长、团队的协作和项目的长期价值，而不是简单追求感动或流量。</w:t>
-      </w:r>
-    </w:p>
-    <w:p>
-      <w:pPr>
-        <w:pStyle w:val="Normal"/>
-      </w:pPr>
-      <w:r>
-        <w:t xml:space="preserve">六天的周至实践已经结束，但它仍然值得回忆和纪念。英语话剧课中学生逐渐敢于开口的变化、英语游戏里的欢笑、御风记课堂上的提问、秦腔脸谱绘画的专注、游园会短暂而轻松的运动时光，以及剪辑视频时重新浮现的每一个镜头，都让我感受到志愿服务的丰富意义。今后，我会继续提升自己的专业能力、教学表达和影像记录能力，把个人所学同社会需要结合起来，在一次次真实的实践中磨炼本领、承担责任，也把这段夏日经历所带来的温暖和动力延续下去。</w:t>
+        <w:t xml:space="preserve">2026年暑假，我参加了西安交通大学英仔爱心社“知行秦川，梦启今夏”周至九峰中学暑期夏令营。我们宣传部第二小组由我、穆思雨和董懿组成，三人一起加入前卫部组织的周至活动，承担授课、助教、摄影和视频记录等工作。六天的行程并不算长，但从第一次走进教室到最后整理素材，我越来越觉得，志愿服务不只是完成一节课或拍下一段视频，而是在与学生和队友的相处中，把准备、陪伴和记录都认真做好。</w:t>
+      </w:r>
+    </w:p>
+    <w:p>
+      <w:pPr>
+        <w:pStyle w:val="Normal"/>
+      </w:pPr>
+      <w:r>
+        <w:t xml:space="preserve">我们小组主要负责英语课程，一共四节：初二两节、初三两节。初二两节由我主讲，分别是英语话剧课和英语游戏课；初三两节由穆思雨主讲，我和董懿担任助教。穆思雨的心理课中，我也只是做了拍摄、纪律协助等旁听助教工作。对我而言，最重要的还是初二英语课。出发前，我担心学生会觉得英语课和日常课堂没有区别，只是换了一批老师来讲单词和句子。实际备课时，我更希望大家能在角色、游戏和合作中感到英语是可以开口表达、可以和同伴一起玩的语言。</w:t>
+      </w:r>
+    </w:p>
+    <w:p>
+      <w:pPr>
+        <w:pStyle w:val="Normal"/>
+      </w:pPr>
+      <w:r>
+        <w:t xml:space="preserve">第一节英语话剧课中，我们把初二学生分成两个小组，分别排练《龟兔赛跑》和《丑小鸭》。一开始，大家对角色分配、台词和表演都有些拘谨。有的同学不太愿意大声说英语，也有人不敢做太夸张的动作。于是我没有急着要求他们完成完整表演，而是先让大家在组内熟悉故事、分配角色、练习台词，再一点点加入动作和语气。排练过程中，学生之间会互相提醒台词，也会因为动作太有趣而一起笑起来。课堂气氛慢慢变得很放松，大家不再只是担心“说得对不对”，而是开始投入角色。</w:t>
+      </w:r>
+    </w:p>
+    <w:p>
+      <w:pPr>
+        <w:pStyle w:val="Normal"/>
+      </w:pPr>
+      <w:r>
+        <w:t xml:space="preserve">让我印象最深的是最后展示的环节。两组同学走到前面，把排练的故事真正演出来。虽然表演并不追求专业，也有同学偶尔停顿或忍不住笑场，但台下的同学会给他们掌声和鼓励。那一刻我感到，话剧课的价值不只是让学生记住几句英语台词，而是让原本不太敢开口的同学愿意站到讲台前，和伙伴一起完成一段表达。作为主讲者，我也更明白，课堂不一定要把所有内容讲得很满，给学生留出合作、尝试和展示的空间同样重要。</w:t>
+      </w:r>
+    </w:p>
+    <w:p>
+      <w:pPr>
+        <w:pStyle w:val="Normal"/>
+      </w:pPr>
+      <w:r>
+        <w:t xml:space="preserve">第二节英语游戏课，我设计了 Simon Says 和 English Act Out 等互动环节。Simon Says 是听指令游戏：如果指令前带有“Simon says”，大家就要照做；如果没有，则不能做动作。比如“Simon says stand up”时同学们要站起来，但只说“stand up”时就不能动。这个游戏看似简单，却很考验注意力和听力反应。学生常常会因为下意识跟着动作而“中招”，现场笑声不断。大家在反复听、反复判断的过程中，自然练习了常见动作词和课堂指令。</w:t>
+      </w:r>
+    </w:p>
+    <w:p>
+      <w:pPr>
+        <w:pStyle w:val="Normal"/>
+      </w:pPr>
+      <w:r>
+        <w:t xml:space="preserve">English Act Out 则更强调表达和猜测。我给出题目和四个选项，每个选项对应一个需要表演的动作；被指定的同学到讲台上表演，下面的同学根据动作猜他演的是哪一个选项。这个环节最热闹。有的同学为了让大家猜中，会努力把动作做得特别夸张；台下的同学一边观察、一边用英语表达自己的猜测，常常笑得停不下来。课堂没有什么架子，大家像一起玩游戏一样练习英语。通过这节课，我感到兴趣不是靠口头鼓励产生的，而是在学生真正参与、真正开心时自然出现的。</w:t>
+      </w:r>
+    </w:p>
+    <w:p>
+      <w:pPr>
+        <w:pStyle w:val="Normal"/>
+      </w:pPr>
+      <w:r>
+        <w:t xml:space="preserve">除了英语课，我还负责“御风记”航空发动机科普课。我没有在现场折纸飞机，而是通过网页交互模拟动画来演示飞行和发动机相关原理。课程从松手气球等生活现象切入，介绍发动机的基本工作过程、飞行中的力学平衡，以及人工智能如何辅助工程师优化设计。我希望把能源与动力专业中较抽象的知识转化为学生看得见、能跟着思考的画面。学生会问飞机为什么能飞、发动机为什么能承受高温，这些问题让我意识到，科普课最重要的不是一次讲完多少专业知识，而是让学生愿意继续追问。作为能源与动力工程专业学生，我也在这次授课中练习了如何用更清楚、更贴近生活的方式表达自己的专业。</w:t>
+      </w:r>
+    </w:p>
+    <w:p>
+      <w:pPr>
+        <w:pStyle w:val="Normal"/>
+      </w:pPr>
+      <w:r>
+        <w:t xml:space="preserve">实践中的许多片段也让我感到快乐。第三天下午的游园会，我带着学生到操场上一起打乒乓球、跑步。时间不长，但在课堂之外，大家都更放松，志愿者和学生之间的距离也更近了一些。第四天下午，我和穆思雨参加了由邱鑫如、张艳阳主讲的秦腔艺术脸谱绘画课。我们和学生一起在面具上作画。我已经很久没有认真画画，重新拿起画笔时感到新奇又有趣。看到学生专注地给面具上色、互相展示作品，我也体会到，支教不只是知识讲授，还可以通过传统文化和动手创作让大家发现兴趣、获得快乐。</w:t>
+      </w:r>
+    </w:p>
+    <w:p>
+      <w:pPr>
+        <w:pStyle w:val="Normal"/>
+      </w:pPr>
+      <w:r>
+        <w:t xml:space="preserve">在教学之外，我和董懿承担了主要摄影任务，我还负责本次活动的视频总协调。我拍摄了许多课堂、活动和日常相处的片段，并在活动后剪辑完成约五分钟的活动总结视频。为了记录更完整的活动现场，我也带了无人机，在不影响活动秩序和安全的前提下做了一些航拍。剪视频时，我一遍遍回看素材，才发现六天过得很快：英语话剧展示时的掌声、游戏课里的笑声、操场上的身影、面具上的颜色，都重新连成了这段夏日记忆。我最强烈的感受是舍不得。这些镜头不只是宣传素材，也是大家共同经历过的真实片段，值得被好好保存。</w:t>
+      </w:r>
+    </w:p>
+    <w:p>
+      <w:pPr>
+        <w:pStyle w:val="Normal"/>
+      </w:pPr>
+      <w:r>
+        <w:t xml:space="preserve">这次实践让我重新理解了宣传工作的意义。影像记录不应只是追求热闹或好看，而应该真实呈现活动过程，记录学生的参与和团队的协作，同时尊重学生隐私和拍摄边界。一次顺利的课堂背后，有主讲者的备课、助教的配合、摄影者的观察，也有学生愿意参与的信任。作为宣传部成员，我希望以后能继续提升拍摄和剪辑能力，让视频既有温度，也有分寸。</w:t>
+      </w:r>
+    </w:p>
+    <w:p>
+      <w:pPr>
+        <w:pStyle w:val="Normal"/>
+      </w:pPr>
+      <w:r>
+        <w:t xml:space="preserve">从思政实践的角度看，这段经历让我明白，“服务社会”不是抽象口号，而是认真做好每一件具体的小事：备好一节课，接住学生的问题，维持好活动秩序，和队友互相补位，如实记录实践过程。通过与九峰中学学生的相处，我看到他们有很强的好奇心和对未来的期待；大学生能做的，不是居高临下地给予，而是用所学知识和真诚陪伴，为这种期待提供一点支持。</w:t>
+      </w:r>
+    </w:p>
+    <w:p>
+      <w:pPr>
+        <w:pStyle w:val="Normal"/>
+      </w:pPr>
+      <w:r>
+        <w:t xml:space="preserve">我认为，今后的支教活动可以更加重视课程设计和长期衔接。暑期夏令营时间有限，但可以与学期中的线上助学、阅读分享或科普答疑结合，让短期活动成为长期陪伴的起点。志愿者出发前也可以多进行试讲和磨课，根据学生年龄、兴趣和基础调整课程难度，并在课后通过作品、反馈或教师观察了解学生真正的收获。对我来说，周至实践已经结束，但英语课中的笑声、御风记课堂上的提问和剪视频时的不舍都会留在记忆里。今后我会继续提升专业表达、教学组织和影像记录能力，在更多真实的实践中磨炼本领、承担责任。</w:t>
       </w:r>
     </w:p>
     <w:p>

</xml_diff>

<commit_message>
align Zhouzhi practice record with activity details
Co-authored-by: arena-agent <297053741+arena-agent@users.noreply.github.com>
</commit_message>
<xml_diff>
--- a/deliverables/孙承泽-思政课实践教学活动记录册_填报稿.docx
+++ b/deliverables/孙承泽-思政课实践教学活动记录册_填报稿.docx
@@ -127,7 +127,7 @@
         <w:pStyle w:val="Normal"/>
       </w:pPr>
       <w:r>
-        <w:t xml:space="preserve">2026年7月，我参加西安交通大学英仔爱心社“知行秦川，梦启今夏”周至九峰中学暑期夏令营，开展志愿服务与科普教学。实践中，我围绕“御风记”设计并讲授两节航空发动机科普课：从松手气球这一生活现象切入，介绍发动机的基本工作过程、飞行中的力学平衡，以及人工智能辅助工程设计等内容；同时，我与队友组织初二学生排练《龟兔赛跑》《丑小鸭》等英语话剧，帮助同学们在角色分工、台词练习和舞台表达中提升开口交流的勇气。此次实践使我更加理解了教育帮扶应尊重学生差异、贴近生活经验、激发主动探索。今后可进一步完善高校与乡镇学校的长期课程资源共享、志愿者岗前培训和课程反馈机制，让短期夏令营与常态化线上助学形成更稳定的衔接。</w:t>
+        <w:t xml:space="preserve">2026年7月，我参加西安交通大学英仔爱心社“知行秦川，梦启今夏”周至九峰中学暑期夏令营。作为宣传部第二小组成员，我主讲初二英语话剧课、英语游戏课，并参与“御风记”航空发动机科普、摄影和视频统筹。话剧课中，学生分组排练《龟兔赛跑》《丑小鸭》；游戏课通过 Simon Says、English Act Out 练习听指令、动作表达和英语猜测。我还参与游园会互动及秦腔脸谱绘画体验，完成约五分钟活动总结视频。此次实践让我认识到，课程应贴近学生兴趣，志愿服务需要长期陪伴、真实记录和团队协作。建议加强试讲、课堂流程演练和课后反馈，推动夏令营与线上助学衔接。</w:t>
       </w:r>
     </w:p>
     <w:p>
@@ -151,15 +151,15 @@
         <w:pStyle w:val="Normal"/>
       </w:pPr>
       <w:r>
-        <w:t xml:space="preserve">我们小组主要负责英语课程，一共四节：初二两节、初三两节。初二两节由我主讲，分别是英语话剧课和英语游戏课；初三两节由穆思雨主讲，我和董懿担任助教。穆思雨的心理课中，我也只是做了拍摄、纪律协助等旁听助教工作。对我而言，最重要的还是初二英语课。出发前，我担心学生会觉得英语课和日常课堂没有区别，只是换了一批老师来讲单词和句子。实际备课时，我更希望大家能在角色、游戏和合作中感到英语是可以开口表达、可以和同伴一起玩的语言。</w:t>
-      </w:r>
-    </w:p>
-    <w:p>
-      <w:pPr>
-        <w:pStyle w:val="Normal"/>
-      </w:pPr>
-      <w:r>
-        <w:t xml:space="preserve">第一节英语话剧课中，我们把初二学生分成两个小组，分别排练《龟兔赛跑》和《丑小鸭》。一开始，大家对角色分配、台词和表演都有些拘谨。有的同学不太愿意大声说英语，也有人不敢做太夸张的动作。于是我没有急着要求他们完成完整表演，而是先让大家在组内熟悉故事、分配角色、练习台词，再一点点加入动作和语气。排练过程中，学生之间会互相提醒台词，也会因为动作太有趣而一起笑起来。课堂气氛慢慢变得很放松，大家不再只是担心“说得对不对”，而是开始投入角色。</w:t>
+        <w:t xml:space="preserve">我们小组主要负责英语课程，一共四节：初二两节、初三两节。初二两节由我主讲，分别是英语话剧课和英语游戏课；初三两节由穆思雨主讲，我和董懿担任助教。穆思雨的心理课中，我只做了拍摄、纪律协助等旁听助教工作。对我而言，最重要的还是初二英语课。出发前，我担心学生会觉得英语课和日常课堂没有区别，只是换了一批老师来讲单词和句子。因此在准备时，我更希望大家能在角色、游戏和合作中感到英语是可以开口表达、可以和同伴一起玩的语言。</w:t>
+      </w:r>
+    </w:p>
+    <w:p>
+      <w:pPr>
+        <w:pStyle w:val="Normal"/>
+      </w:pPr>
+      <w:r>
+        <w:t xml:space="preserve">第一节英语话剧课中，我们把初二学生分成两个小组，分别排练《龟兔赛跑》和《丑小鸭》。一开始，大家对角色分配、台词和表演都有些拘谨。有的同学不太愿意大声说英语，也有人不敢做太夸张的动作。于是我没有急着要求他们完成完整表演，而是先让大家在组内熟悉故事、分配角色、练习台词，再逐步加入动作和语气。排练过程中，学生会互相提醒台词，也会因为动作太有趣而一起笑起来。课堂气氛慢慢变得很放松，大家不再只担心“说得对不对”，而是开始投入角色。</w:t>
       </w:r>
     </w:p>
     <w:p>
@@ -175,7 +175,7 @@
         <w:pStyle w:val="Normal"/>
       </w:pPr>
       <w:r>
-        <w:t xml:space="preserve">第二节英语游戏课，我设计了 Simon Says 和 English Act Out 等互动环节。Simon Says 是听指令游戏：如果指令前带有“Simon says”，大家就要照做；如果没有，则不能做动作。比如“Simon says stand up”时同学们要站起来，但只说“stand up”时就不能动。这个游戏看似简单，却很考验注意力和听力反应。学生常常会因为下意识跟着动作而“中招”，现场笑声不断。大家在反复听、反复判断的过程中，自然练习了常见动作词和课堂指令。</w:t>
+        <w:t xml:space="preserve">第二节英语游戏课，我设计了 Simon Says 和 English Act Out 等互动环节。Simon Says 是听指令游戏：如果指令前带有“Simon says”，大家就要照做；如果没有，则不能做动作。比如“Simon says stand up”时同学们要站起来，但只说“stand up”时就不能动。这个游戏看似简单，却很考验注意力和听力反应。学生常常会因为下意识跟着动作而“中招”，现场笑声不断，大家也在反复听、反复判断中练习了常见动作词和课堂指令。</w:t>
       </w:r>
     </w:p>
     <w:p>
@@ -191,47 +191,47 @@
         <w:pStyle w:val="Normal"/>
       </w:pPr>
       <w:r>
-        <w:t xml:space="preserve">除了英语课，我还负责“御风记”航空发动机科普课。我没有在现场折纸飞机，而是通过网页交互模拟动画来演示飞行和发动机相关原理。课程从松手气球等生活现象切入，介绍发动机的基本工作过程、飞行中的力学平衡，以及人工智能如何辅助工程师优化设计。我希望把能源与动力专业中较抽象的知识转化为学生看得见、能跟着思考的画面。学生会问飞机为什么能飞、发动机为什么能承受高温，这些问题让我意识到，科普课最重要的不是一次讲完多少专业知识，而是让学生愿意继续追问。作为能源与动力工程专业学生，我也在这次授课中练习了如何用更清楚、更贴近生活的方式表达自己的专业。</w:t>
-      </w:r>
-    </w:p>
-    <w:p>
-      <w:pPr>
-        <w:pStyle w:val="Normal"/>
-      </w:pPr>
-      <w:r>
-        <w:t xml:space="preserve">实践中的许多片段也让我感到快乐。第三天下午的游园会，我带着学生到操场上一起打乒乓球、跑步。时间不长，但在课堂之外，大家都更放松，志愿者和学生之间的距离也更近了一些。第四天下午，我和穆思雨参加了由邱鑫如、张艳阳主讲的秦腔艺术脸谱绘画课。我们和学生一起在面具上作画。我已经很久没有认真画画，重新拿起画笔时感到新奇又有趣。看到学生专注地给面具上色、互相展示作品，我也体会到，支教不只是知识讲授，还可以通过传统文化和动手创作让大家发现兴趣、获得快乐。</w:t>
-      </w:r>
-    </w:p>
-    <w:p>
-      <w:pPr>
-        <w:pStyle w:val="Normal"/>
-      </w:pPr>
-      <w:r>
-        <w:t xml:space="preserve">在教学之外，我和董懿承担了主要摄影任务，我还负责本次活动的视频总协调。我拍摄了许多课堂、活动和日常相处的片段，并在活动后剪辑完成约五分钟的活动总结视频。为了记录更完整的活动现场，我也带了无人机，在不影响活动秩序和安全的前提下做了一些航拍。剪视频时，我一遍遍回看素材，才发现六天过得很快：英语话剧展示时的掌声、游戏课里的笑声、操场上的身影、面具上的颜色，都重新连成了这段夏日记忆。我最强烈的感受是舍不得。这些镜头不只是宣传素材，也是大家共同经历过的真实片段，值得被好好保存。</w:t>
-      </w:r>
-    </w:p>
-    <w:p>
-      <w:pPr>
-        <w:pStyle w:val="Normal"/>
-      </w:pPr>
-      <w:r>
-        <w:t xml:space="preserve">这次实践让我重新理解了宣传工作的意义。影像记录不应只是追求热闹或好看，而应该真实呈现活动过程，记录学生的参与和团队的协作，同时尊重学生隐私和拍摄边界。一次顺利的课堂背后，有主讲者的备课、助教的配合、摄影者的观察，也有学生愿意参与的信任。作为宣传部成员，我希望以后能继续提升拍摄和剪辑能力，让视频既有温度，也有分寸。</w:t>
-      </w:r>
-    </w:p>
-    <w:p>
-      <w:pPr>
-        <w:pStyle w:val="Normal"/>
-      </w:pPr>
-      <w:r>
-        <w:t xml:space="preserve">从思政实践的角度看，这段经历让我明白，“服务社会”不是抽象口号，而是认真做好每一件具体的小事：备好一节课，接住学生的问题，维持好活动秩序，和队友互相补位，如实记录实践过程。通过与九峰中学学生的相处，我看到他们有很强的好奇心和对未来的期待；大学生能做的，不是居高临下地给予，而是用所学知识和真诚陪伴，为这种期待提供一点支持。</w:t>
-      </w:r>
-    </w:p>
-    <w:p>
-      <w:pPr>
-        <w:pStyle w:val="Normal"/>
-      </w:pPr>
-      <w:r>
-        <w:t xml:space="preserve">我认为，今后的支教活动可以更加重视课程设计和长期衔接。暑期夏令营时间有限，但可以与学期中的线上助学、阅读分享或科普答疑结合，让短期活动成为长期陪伴的起点。志愿者出发前也可以多进行试讲和磨课，根据学生年龄、兴趣和基础调整课程难度，并在课后通过作品、反馈或教师观察了解学生真正的收获。对我来说，周至实践已经结束，但英语课中的笑声、御风记课堂上的提问和剪视频时的不舍都会留在记忆里。今后我会继续提升专业表达、教学组织和影像记录能力，在更多真实的实践中磨炼本领、承担责任。</w:t>
+        <w:t xml:space="preserve">除了英语课，我还负责“御风记”航空发动机科普课。我没有在现场折纸飞机，而是通过网页交互模拟动画演示飞行和发动机相关原理。课程从松手气球等生活现象切入，介绍发动机的基本工作过程、飞行中的力学平衡，以及人工智能如何辅助工程师优化设计。我希望把能源与动力专业中较抽象的知识转化为学生看得见、能跟着思考的画面。学生会问飞机为什么能飞、发动机为什么能承受高温，这些问题让我意识到，科普课最重要的不是一次讲完多少专业知识，而是让学生愿意继续追问。作为能源与动力工程专业学生，我也在这次授课中练习了如何用更清楚、更贴近生活的方式表达自己的专业。</w:t>
+      </w:r>
+    </w:p>
+    <w:p>
+      <w:pPr>
+        <w:pStyle w:val="Normal"/>
+      </w:pPr>
+      <w:r>
+        <w:t xml:space="preserve">实践中的许多片段也让我感到快乐。第三天下午的游园会设置了创意机械臂、空白小人偶涂画、外科缝线模拟等互动区域。我带着学生到操场活动，一起打乒乓球、跑步。时间不长，但课堂之外的相处更放松，志愿者和学生之间的距离也更近了一些。第四天下午，我和穆思雨参加了由邱鑫如、张艳阳主讲的秦腔艺术脸谱绘画课。课堂先介绍秦腔艺术的起源与传承，随后大家在面具上作画，体验脸谱色彩和造型。我已经很久没有认真画画，重新拿起画笔时感到新奇又有趣。看到学生专注地给面具上色、互相展示作品，我也体会到，支教不只是知识讲授，还可以通过传统文化和动手创作让大家发现兴趣、获得快乐。</w:t>
+      </w:r>
+    </w:p>
+    <w:p>
+      <w:pPr>
+        <w:pStyle w:val="Normal"/>
+      </w:pPr>
+      <w:r>
+        <w:t xml:space="preserve">在教学之外，我和董懿承担了主要摄影任务，我还负责本次活动的视频总协调。我拍摄了许多课堂、活动和日常相处的片段，并在活动后剪辑完成约五分钟的活动总结视频。为了记录更完整的活动现场，我也带了无人机，在不影响活动秩序和安全的前提下做了一些航拍。剪视频时，我一遍遍回看素材，才发现六天过得很快：英语话剧展示时的掌声、游戏课里的笑声、游园会中的身影、面具上的颜色，都重新连成了这段夏日记忆。我最强烈的感受是舍不得。这些镜头不只是宣传素材，也是大家共同经历过的真实片段，值得被好好保存。</w:t>
+      </w:r>
+    </w:p>
+    <w:p>
+      <w:pPr>
+        <w:pStyle w:val="Normal"/>
+      </w:pPr>
+      <w:r>
+        <w:t xml:space="preserve">这次实践让我重新理解了宣传工作的意义。影像记录不应只是追求热闹或好看，而应该真实呈现活动过程，记录学生的参与和团队的协作，同时尊重学生隐私和拍摄边界。一次顺利的课堂背后，有主讲者的准备、助教的配合、摄影者的观察，也有学生愿意参与的信任。作为宣传部成员，我希望以后能继续提升拍摄和剪辑能力，让视频既有温度，也有分寸。</w:t>
+      </w:r>
+    </w:p>
+    <w:p>
+      <w:pPr>
+        <w:pStyle w:val="Normal"/>
+      </w:pPr>
+      <w:r>
+        <w:t xml:space="preserve">从思政实践的角度看，这段经历让我明白，“服务社会”不是抽象口号，而是认真做好每一件具体的小事：准备一节课，接住学生的问题，维持好活动秩序，和队友互相补位，如实记录实践过程。通过与九峰中学学生的相处，我看到他们有很强的好奇心和对未来的期待；大学生能做的，不是居高临下地给予，而是用所学知识和真诚陪伴，为这种期待提供一点支持。</w:t>
+      </w:r>
+    </w:p>
+    <w:p>
+      <w:pPr>
+        <w:pStyle w:val="Normal"/>
+      </w:pPr>
+      <w:r>
+        <w:t xml:space="preserve">我认为，今后的支教活动可以更加重视课程设计和长期衔接。暑期夏令营时间有限，但可以与学期中的线上助学、阅读分享或科普答疑结合，让短期活动成为长期陪伴的起点。志愿者出发前也可以更多进行试讲、完善教案、演练课堂流程，根据学生年龄、兴趣和基础调整课程难度，并在课后通过作品、反馈或教师观察了解学生真正的收获。对我来说，周至实践已经结束，但英语课中的笑声、御风记课堂上的提问和剪视频时的不舍都会留在记忆里。今后我会继续提升专业表达、教学组织和影像记录能力，在更多真实的实践中磨炼本领、承担责任。</w:t>
       </w:r>
     </w:p>
     <w:p>

</xml_diff>